<commit_message>
PLC: San_test ladder support, timing check tool, heartbeat from connect
- plc_ladder selects the timing model (final_year | san_test); ladder_check / ladder_sim
  read parallel links and the San_test design (heartbeat M20/M3/M12, contactor feedback)
- HeartbeatPump now starts when the PLC link is up (first beat at once) and keeps running
  while the line is stopped; RESET FAULT beats before sending M12; new alarm HEARTBEAT_FAILED
- tools/timing_check.py + timing_check.bat: plan / watch / travel; --apply refuses when
  plc_ladder is unset and keeps time-stamped backups
- GUI self-test pins plc_ladder final_year and estop_device so it does not depend on settings.json
- docs: TIMING_CHECK_GUIDE (new), FEATURE_STATUS, PLC_COMMUNICATION, CAMERA_PLACEMENT_AND_LINE_PLAN
</commit_message>
<xml_diff>
--- a/FINAL_YEAR_BLACKBOOK/23_Project_Documentation/hardware/CAMERA_PLACEMENT_AND_LINE_PLAN.docx
+++ b/FINAL_YEAR_BLACKBOOK/23_Project_Documentation/hardware/CAMERA_PLACEMENT_AND_LINE_PLAN.docx
@@ -2156,6 +2156,11 @@
     </w:p>
     <w:bookmarkEnd w:id="31"/>
     <w:bookmarkEnd w:id="32"/>
+    <w:p>
+      <w:r>
+        <w:t>Update 2026-10-19: the built rig (two cameras on separate USB 3 ports, diagonal layout, autofocus off, 6500 K LED strips) and the step-by-step setup and acceptance checks are in CAMERA_COMMISSIONING_CHECKLIST.docx.</w:t>
+      </w:r>
+    </w:p>
     <w:sectPr>
       <w:footnotePr>
         <w:numRestart w:val="eachSect"/>

</xml_diff>